<commit_message>
updated role basded for exhibts
</commit_message>
<xml_diff>
--- a/backend-exhibits/INCLUDED IN TEAMS TO TEAMS MIGRATION FEATURES.docx
+++ b/backend-exhibits/INCLUDED IN TEAMS TO TEAMS MIGRATION FEATURES.docx
@@ -39,7 +39,7 @@
               <w:rPr>
                 <w:b/>
               </w:rPr>
-              <w:t xml:space="preserve">                                               </w:t>
+              <w:t xml:space="preserve">                                    </w:t>
             </w:r>
             <w:r>
               <w:rPr>
@@ -1220,7 +1220,7 @@
     <w:link w:val="Heading1Char"/>
     <w:uiPriority w:val="9"/>
     <w:qFormat/>
-    <w:rsid w:val="006E7BB4"/>
+    <w:rsid w:val="00236433"/>
     <w:pPr>
       <w:keepNext/>
       <w:keepLines/>
@@ -1243,7 +1243,7 @@
     <w:semiHidden/>
     <w:unhideWhenUsed/>
     <w:qFormat/>
-    <w:rsid w:val="006E7BB4"/>
+    <w:rsid w:val="00236433"/>
     <w:pPr>
       <w:keepNext/>
       <w:keepLines/>
@@ -1266,7 +1266,7 @@
     <w:semiHidden/>
     <w:unhideWhenUsed/>
     <w:qFormat/>
-    <w:rsid w:val="006E7BB4"/>
+    <w:rsid w:val="00236433"/>
     <w:pPr>
       <w:keepNext/>
       <w:keepLines/>
@@ -1289,7 +1289,7 @@
     <w:semiHidden/>
     <w:unhideWhenUsed/>
     <w:qFormat/>
-    <w:rsid w:val="006E7BB4"/>
+    <w:rsid w:val="00236433"/>
     <w:pPr>
       <w:keepNext/>
       <w:keepLines/>
@@ -1312,7 +1312,7 @@
     <w:semiHidden/>
     <w:unhideWhenUsed/>
     <w:qFormat/>
-    <w:rsid w:val="006E7BB4"/>
+    <w:rsid w:val="00236433"/>
     <w:pPr>
       <w:keepNext/>
       <w:keepLines/>
@@ -1333,7 +1333,7 @@
     <w:semiHidden/>
     <w:unhideWhenUsed/>
     <w:qFormat/>
-    <w:rsid w:val="006E7BB4"/>
+    <w:rsid w:val="00236433"/>
     <w:pPr>
       <w:keepNext/>
       <w:keepLines/>
@@ -1356,7 +1356,7 @@
     <w:semiHidden/>
     <w:unhideWhenUsed/>
     <w:qFormat/>
-    <w:rsid w:val="006E7BB4"/>
+    <w:rsid w:val="00236433"/>
     <w:pPr>
       <w:keepNext/>
       <w:keepLines/>
@@ -1377,7 +1377,7 @@
     <w:semiHidden/>
     <w:unhideWhenUsed/>
     <w:qFormat/>
-    <w:rsid w:val="006E7BB4"/>
+    <w:rsid w:val="00236433"/>
     <w:pPr>
       <w:keepNext/>
       <w:keepLines/>
@@ -1400,7 +1400,7 @@
     <w:semiHidden/>
     <w:unhideWhenUsed/>
     <w:qFormat/>
-    <w:rsid w:val="006E7BB4"/>
+    <w:rsid w:val="00236433"/>
     <w:pPr>
       <w:keepNext/>
       <w:keepLines/>
@@ -1443,7 +1443,7 @@
     <w:basedOn w:val="DefaultParagraphFont"/>
     <w:link w:val="Heading1"/>
     <w:uiPriority w:val="9"/>
-    <w:rsid w:val="006E7BB4"/>
+    <w:rsid w:val="00236433"/>
     <w:rPr>
       <w:rFonts w:asciiTheme="majorHAnsi" w:eastAsiaTheme="majorEastAsia" w:hAnsiTheme="majorHAnsi" w:cstheme="majorBidi"/>
       <w:color w:val="0F4761" w:themeColor="accent1" w:themeShade="BF"/>
@@ -1457,7 +1457,7 @@
     <w:link w:val="Heading2"/>
     <w:uiPriority w:val="9"/>
     <w:semiHidden/>
-    <w:rsid w:val="006E7BB4"/>
+    <w:rsid w:val="00236433"/>
     <w:rPr>
       <w:rFonts w:asciiTheme="majorHAnsi" w:eastAsiaTheme="majorEastAsia" w:hAnsiTheme="majorHAnsi" w:cstheme="majorBidi"/>
       <w:color w:val="0F4761" w:themeColor="accent1" w:themeShade="BF"/>
@@ -1471,7 +1471,7 @@
     <w:link w:val="Heading3"/>
     <w:uiPriority w:val="9"/>
     <w:semiHidden/>
-    <w:rsid w:val="006E7BB4"/>
+    <w:rsid w:val="00236433"/>
     <w:rPr>
       <w:rFonts w:eastAsiaTheme="majorEastAsia" w:cstheme="majorBidi"/>
       <w:color w:val="0F4761" w:themeColor="accent1" w:themeShade="BF"/>
@@ -1485,7 +1485,7 @@
     <w:link w:val="Heading4"/>
     <w:uiPriority w:val="9"/>
     <w:semiHidden/>
-    <w:rsid w:val="006E7BB4"/>
+    <w:rsid w:val="00236433"/>
     <w:rPr>
       <w:rFonts w:eastAsiaTheme="majorEastAsia" w:cstheme="majorBidi"/>
       <w:i/>
@@ -1499,7 +1499,7 @@
     <w:link w:val="Heading5"/>
     <w:uiPriority w:val="9"/>
     <w:semiHidden/>
-    <w:rsid w:val="006E7BB4"/>
+    <w:rsid w:val="00236433"/>
     <w:rPr>
       <w:rFonts w:eastAsiaTheme="majorEastAsia" w:cstheme="majorBidi"/>
       <w:color w:val="0F4761" w:themeColor="accent1" w:themeShade="BF"/>
@@ -1511,7 +1511,7 @@
     <w:link w:val="Heading6"/>
     <w:uiPriority w:val="9"/>
     <w:semiHidden/>
-    <w:rsid w:val="006E7BB4"/>
+    <w:rsid w:val="00236433"/>
     <w:rPr>
       <w:rFonts w:eastAsiaTheme="majorEastAsia" w:cstheme="majorBidi"/>
       <w:i/>
@@ -1525,7 +1525,7 @@
     <w:link w:val="Heading7"/>
     <w:uiPriority w:val="9"/>
     <w:semiHidden/>
-    <w:rsid w:val="006E7BB4"/>
+    <w:rsid w:val="00236433"/>
     <w:rPr>
       <w:rFonts w:eastAsiaTheme="majorEastAsia" w:cstheme="majorBidi"/>
       <w:color w:val="595959" w:themeColor="text1" w:themeTint="A6"/>
@@ -1537,7 +1537,7 @@
     <w:link w:val="Heading8"/>
     <w:uiPriority w:val="9"/>
     <w:semiHidden/>
-    <w:rsid w:val="006E7BB4"/>
+    <w:rsid w:val="00236433"/>
     <w:rPr>
       <w:rFonts w:eastAsiaTheme="majorEastAsia" w:cstheme="majorBidi"/>
       <w:i/>
@@ -1551,7 +1551,7 @@
     <w:link w:val="Heading9"/>
     <w:uiPriority w:val="9"/>
     <w:semiHidden/>
-    <w:rsid w:val="006E7BB4"/>
+    <w:rsid w:val="00236433"/>
     <w:rPr>
       <w:rFonts w:eastAsiaTheme="majorEastAsia" w:cstheme="majorBidi"/>
       <w:color w:val="272727" w:themeColor="text1" w:themeTint="D8"/>
@@ -1564,7 +1564,7 @@
     <w:link w:val="TitleChar"/>
     <w:uiPriority w:val="10"/>
     <w:qFormat/>
-    <w:rsid w:val="006E7BB4"/>
+    <w:rsid w:val="00236433"/>
     <w:pPr>
       <w:spacing w:after="80" w:line="240" w:lineRule="auto"/>
       <w:contextualSpacing/>
@@ -1582,7 +1582,7 @@
     <w:basedOn w:val="DefaultParagraphFont"/>
     <w:link w:val="Title"/>
     <w:uiPriority w:val="10"/>
-    <w:rsid w:val="006E7BB4"/>
+    <w:rsid w:val="00236433"/>
     <w:rPr>
       <w:rFonts w:asciiTheme="majorHAnsi" w:eastAsiaTheme="majorEastAsia" w:hAnsiTheme="majorHAnsi" w:cstheme="majorBidi"/>
       <w:spacing w:val="-10"/>
@@ -1598,7 +1598,7 @@
     <w:link w:val="SubtitleChar"/>
     <w:uiPriority w:val="11"/>
     <w:qFormat/>
-    <w:rsid w:val="006E7BB4"/>
+    <w:rsid w:val="00236433"/>
     <w:pPr>
       <w:numPr>
         <w:ilvl w:val="1"/>
@@ -1617,7 +1617,7 @@
     <w:basedOn w:val="DefaultParagraphFont"/>
     <w:link w:val="Subtitle"/>
     <w:uiPriority w:val="11"/>
-    <w:rsid w:val="006E7BB4"/>
+    <w:rsid w:val="00236433"/>
     <w:rPr>
       <w:rFonts w:eastAsiaTheme="majorEastAsia" w:cstheme="majorBidi"/>
       <w:color w:val="595959" w:themeColor="text1" w:themeTint="A6"/>
@@ -1633,7 +1633,7 @@
     <w:link w:val="QuoteChar"/>
     <w:uiPriority w:val="29"/>
     <w:qFormat/>
-    <w:rsid w:val="006E7BB4"/>
+    <w:rsid w:val="00236433"/>
     <w:pPr>
       <w:spacing w:before="160"/>
       <w:jc w:val="center"/>
@@ -1649,7 +1649,7 @@
     <w:basedOn w:val="DefaultParagraphFont"/>
     <w:link w:val="Quote"/>
     <w:uiPriority w:val="29"/>
-    <w:rsid w:val="006E7BB4"/>
+    <w:rsid w:val="00236433"/>
     <w:rPr>
       <w:i/>
       <w:iCs/>
@@ -1661,7 +1661,7 @@
     <w:basedOn w:val="Normal"/>
     <w:uiPriority w:val="34"/>
     <w:qFormat/>
-    <w:rsid w:val="006E7BB4"/>
+    <w:rsid w:val="00236433"/>
     <w:pPr>
       <w:ind w:left="720"/>
       <w:contextualSpacing/>
@@ -1672,7 +1672,7 @@
     <w:basedOn w:val="DefaultParagraphFont"/>
     <w:uiPriority w:val="21"/>
     <w:qFormat/>
-    <w:rsid w:val="006E7BB4"/>
+    <w:rsid w:val="00236433"/>
     <w:rPr>
       <w:i/>
       <w:iCs/>
@@ -1686,7 +1686,7 @@
     <w:link w:val="IntenseQuoteChar"/>
     <w:uiPriority w:val="30"/>
     <w:qFormat/>
-    <w:rsid w:val="006E7BB4"/>
+    <w:rsid w:val="00236433"/>
     <w:pPr>
       <w:pBdr>
         <w:top w:val="single" w:sz="4" w:space="10" w:color="0F4761" w:themeColor="accent1" w:themeShade="BF"/>
@@ -1707,7 +1707,7 @@
     <w:basedOn w:val="DefaultParagraphFont"/>
     <w:link w:val="IntenseQuote"/>
     <w:uiPriority w:val="30"/>
-    <w:rsid w:val="006E7BB4"/>
+    <w:rsid w:val="00236433"/>
     <w:rPr>
       <w:i/>
       <w:iCs/>
@@ -1719,7 +1719,7 @@
     <w:basedOn w:val="DefaultParagraphFont"/>
     <w:uiPriority w:val="32"/>
     <w:qFormat/>
-    <w:rsid w:val="006E7BB4"/>
+    <w:rsid w:val="00236433"/>
     <w:rPr>
       <w:b/>
       <w:bCs/>

</xml_diff>